<commit_message>
actualiacion de endpoint por nuevo modelo de demanda
</commit_message>
<xml_diff>
--- a/templates/Borrado_Demanda_Vehiculo_Peaton.docx
+++ b/templates/Borrado_Demanda_Vehiculo_Peaton.docx
@@ -544,23 +544,15 @@
           <w:szCs w:val="24"/>
           <w:highlight w:val="yellow"/>
         </w:rPr>
-        <w:t>MediadorNombre</w:t>
-      </w:r>
-      <w:r>
-        <w:rPr>
-          <w:rFonts w:ascii="Times New Roman" w:eastAsia="Times New Roman" w:hAnsi="Times New Roman" w:cs="Times New Roman"/>
-          <w:sz w:val="24"/>
-          <w:szCs w:val="24"/>
-        </w:rPr>
-        <w:t>, sito</w:t>
-      </w:r>
-      <w:r>
-        <w:rPr>
-          <w:rFonts w:ascii="Times New Roman" w:eastAsia="Times New Roman" w:hAnsi="Times New Roman" w:cs="Times New Roman"/>
-          <w:sz w:val="24"/>
-          <w:szCs w:val="24"/>
-        </w:rPr>
-        <w:t xml:space="preserve"> en la calle Santa Fe 1391, de CABA, arrojando resultado negativo todo intento de conciliación.</w:t>
+        <w:t>{{ NombreMediador }}</w:t>
+      </w:r>
+      <w:r>
+        <w:rPr>
+          <w:rFonts w:ascii="Times New Roman" w:eastAsia="Times New Roman" w:hAnsi="Times New Roman" w:cs="Times New Roman"/>
+          <w:sz w:val="24"/>
+          <w:szCs w:val="24"/>
+        </w:rPr>
+        <w:t>, sito en la calle Santa Fe 1391, de CABA, arrojando resultado negativo todo intento de conciliación.</w:t>
       </w:r>
     </w:p>
     <w:p>
@@ -2969,18 +2961,7 @@
           <w:szCs w:val="24"/>
           <w:highlight w:val="yellow"/>
         </w:rPr>
-        <w:t>MontoIncapacidad</w:t>
-      </w:r>
-      <w:r>
-        <w:rPr>
-          <w:rFonts w:ascii="Times New Roman" w:eastAsia="Times New Roman" w:hAnsi="Times New Roman" w:cs="Times New Roman"/>
-          <w:b/>
-          <w:bCs/>
-          <w:sz w:val="24"/>
-          <w:szCs w:val="24"/>
-          <w:highlight w:val="yellow"/>
-        </w:rPr>
-        <w:t>Numeros</w:t>
+        <w:t>MontoIncapacidadNumeros</w:t>
       </w:r>
       <w:r>
         <w:rPr>
@@ -3499,18 +3480,7 @@
           <w:szCs w:val="24"/>
           <w:highlight w:val="yellow"/>
         </w:rPr>
-        <w:t>DañoMoral</w:t>
-      </w:r>
-      <w:r>
-        <w:rPr>
-          <w:rFonts w:ascii="Times New Roman" w:eastAsia="Times New Roman" w:hAnsi="Times New Roman" w:cs="Times New Roman"/>
-          <w:b/>
-          <w:bCs/>
-          <w:sz w:val="24"/>
-          <w:szCs w:val="24"/>
-          <w:highlight w:val="yellow"/>
-        </w:rPr>
-        <w:t>Numeros</w:t>
+        <w:t>DañoMoralNumeros</w:t>
       </w:r>
       <w:r>
         <w:rPr>
@@ -3867,17 +3837,7 @@
           <w:sz w:val="24"/>
           <w:szCs w:val="24"/>
         </w:rPr>
-        <w:t xml:space="preserve">     ) para el actor</w:t>
-      </w:r>
-      <w:r>
-        <w:rPr>
-          <w:rFonts w:ascii="Times New Roman" w:eastAsia="Times New Roman" w:hAnsi="Times New Roman" w:cs="Times New Roman"/>
-          <w:b/>
-          <w:bCs/>
-          <w:sz w:val="24"/>
-          <w:szCs w:val="24"/>
-        </w:rPr>
-        <w:t xml:space="preserve">, </w:t>
+        <w:t xml:space="preserve">     ) para el actor, </w:t>
       </w:r>
       <w:r>
         <w:rPr>
@@ -10230,7 +10190,6 @@
   <w:style w:type="character" w:default="1" w:styleId="Fuentedeprrafopredeter">
     <w:name w:val="Default Paragraph Font"/>
     <w:uiPriority w:val="1"/>
-    <w:semiHidden/>
     <w:unhideWhenUsed/>
   </w:style>
   <w:style w:type="table" w:default="1" w:styleId="Tablanormal">

</xml_diff>